<commit_message>
Support both templates and add loan dates
</commit_message>
<xml_diff>
--- a/public/acta_prestamo.docx
+++ b/public/acta_prestamo.docx
@@ -74,7 +74,15 @@
                 <w:rStyle w:val="Normal1"/>
                 <w:rFonts w:ascii="Aptos Display" w:hAnsi="Aptos Display"/>
               </w:rPr>
-              <w:t>{ti_</w:t>
+              <w:t>{</w:t>
+            </w:r>
+            <w:proofErr w:type="spellStart"/>
+            <w:r>
+              <w:rPr>
+                <w:rStyle w:val="Normal1"/>
+                <w:rFonts w:ascii="Aptos Display" w:hAnsi="Aptos Display"/>
+              </w:rPr>
+              <w:t>ti_</w:t>
             </w:r>
             <w:r>
               <w:rPr>
@@ -83,6 +91,7 @@
               </w:rPr>
               <w:t>rut</w:t>
             </w:r>
+            <w:proofErr w:type="spellEnd"/>
             <w:r>
               <w:rPr>
                 <w:rStyle w:val="Normal1"/>
@@ -110,7 +119,23 @@
                 <w:rStyle w:val="Normal1"/>
                 <w:rFonts w:ascii="Aptos Display" w:hAnsi="Aptos Display"/>
               </w:rPr>
-              <w:t>{ti_nombre}</w:t>
+              <w:t>{</w:t>
+            </w:r>
+            <w:proofErr w:type="spellStart"/>
+            <w:r>
+              <w:rPr>
+                <w:rStyle w:val="Normal1"/>
+                <w:rFonts w:ascii="Aptos Display" w:hAnsi="Aptos Display"/>
+              </w:rPr>
+              <w:t>ti_nombre</w:t>
+            </w:r>
+            <w:proofErr w:type="spellEnd"/>
+            <w:r>
+              <w:rPr>
+                <w:rStyle w:val="Normal1"/>
+                <w:rFonts w:ascii="Aptos Display" w:hAnsi="Aptos Display"/>
+              </w:rPr>
+              <w:t>}</w:t>
             </w:r>
           </w:p>
         </w:tc>
@@ -132,7 +157,23 @@
                 <w:rStyle w:val="Normal1"/>
                 <w:rFonts w:ascii="Aptos Display" w:hAnsi="Aptos Display"/>
               </w:rPr>
-              <w:t>{ti_subdireccion}</w:t>
+              <w:t>{</w:t>
+            </w:r>
+            <w:proofErr w:type="spellStart"/>
+            <w:r>
+              <w:rPr>
+                <w:rStyle w:val="Normal1"/>
+                <w:rFonts w:ascii="Aptos Display" w:hAnsi="Aptos Display"/>
+              </w:rPr>
+              <w:t>ti_subdireccion</w:t>
+            </w:r>
+            <w:proofErr w:type="spellEnd"/>
+            <w:r>
+              <w:rPr>
+                <w:rStyle w:val="Normal1"/>
+                <w:rFonts w:ascii="Aptos Display" w:hAnsi="Aptos Display"/>
+              </w:rPr>
+              <w:t>}</w:t>
             </w:r>
           </w:p>
         </w:tc>
@@ -279,7 +320,15 @@
                 <w:rStyle w:val="Normal1"/>
                 <w:rFonts w:ascii="Aptos Display" w:hAnsi="Aptos Display"/>
               </w:rPr>
-              <w:t>{solicitante_</w:t>
+              <w:t>{</w:t>
+            </w:r>
+            <w:proofErr w:type="spellStart"/>
+            <w:r>
+              <w:rPr>
+                <w:rStyle w:val="Normal1"/>
+                <w:rFonts w:ascii="Aptos Display" w:hAnsi="Aptos Display"/>
+              </w:rPr>
+              <w:t>solicitante_</w:t>
             </w:r>
             <w:r>
               <w:rPr>
@@ -288,6 +337,7 @@
               </w:rPr>
               <w:t>rut</w:t>
             </w:r>
+            <w:proofErr w:type="spellEnd"/>
             <w:r>
               <w:rPr>
                 <w:rStyle w:val="Normal1"/>
@@ -315,7 +365,23 @@
                 <w:rStyle w:val="Normal1"/>
                 <w:rFonts w:ascii="Aptos Display" w:hAnsi="Aptos Display"/>
               </w:rPr>
-              <w:t>{solicitante_nombre}</w:t>
+              <w:t>{</w:t>
+            </w:r>
+            <w:proofErr w:type="spellStart"/>
+            <w:r>
+              <w:rPr>
+                <w:rStyle w:val="Normal1"/>
+                <w:rFonts w:ascii="Aptos Display" w:hAnsi="Aptos Display"/>
+              </w:rPr>
+              <w:t>solicitante_nombre</w:t>
+            </w:r>
+            <w:proofErr w:type="spellEnd"/>
+            <w:r>
+              <w:rPr>
+                <w:rStyle w:val="Normal1"/>
+                <w:rFonts w:ascii="Aptos Display" w:hAnsi="Aptos Display"/>
+              </w:rPr>
+              <w:t>}</w:t>
             </w:r>
           </w:p>
         </w:tc>
@@ -337,7 +403,23 @@
                 <w:rStyle w:val="Normal1"/>
                 <w:rFonts w:ascii="Aptos Display" w:hAnsi="Aptos Display"/>
               </w:rPr>
-              <w:t>{solicitante_subdireccion}</w:t>
+              <w:t>{</w:t>
+            </w:r>
+            <w:proofErr w:type="spellStart"/>
+            <w:r>
+              <w:rPr>
+                <w:rStyle w:val="Normal1"/>
+                <w:rFonts w:ascii="Aptos Display" w:hAnsi="Aptos Display"/>
+              </w:rPr>
+              <w:t>solicitante_subdireccion</w:t>
+            </w:r>
+            <w:proofErr w:type="spellEnd"/>
+            <w:r>
+              <w:rPr>
+                <w:rStyle w:val="Normal1"/>
+                <w:rFonts w:ascii="Aptos Display" w:hAnsi="Aptos Display"/>
+              </w:rPr>
+              <w:t>}</w:t>
             </w:r>
           </w:p>
         </w:tc>
@@ -537,12 +619,21 @@
                 <w:rFonts w:ascii="Aptos Display" w:hAnsi="Aptos Display"/>
               </w:rPr>
             </w:pPr>
+            <w:proofErr w:type="spellStart"/>
             <w:r>
               <w:rPr>
                 <w:rStyle w:val="Normal1"/>
                 <w:rFonts w:ascii="Aptos Display" w:hAnsi="Aptos Display"/>
               </w:rPr>
-              <w:t>N° de serie</w:t>
+              <w:t>N°</w:t>
+            </w:r>
+            <w:proofErr w:type="spellEnd"/>
+            <w:r>
+              <w:rPr>
+                <w:rStyle w:val="Normal1"/>
+                <w:rFonts w:ascii="Aptos Display" w:hAnsi="Aptos Display"/>
+              </w:rPr>
+              <w:t xml:space="preserve"> de serie</w:t>
             </w:r>
           </w:p>
         </w:tc>
@@ -565,7 +656,23 @@
                 <w:rStyle w:val="Normal1"/>
                 <w:rFonts w:ascii="Aptos Display" w:hAnsi="Aptos Display"/>
               </w:rPr>
-              <w:t>{#equipos}{tipo}</w:t>
+              <w:t>{#</w:t>
+            </w:r>
+            <w:proofErr w:type="gramStart"/>
+            <w:r>
+              <w:rPr>
+                <w:rStyle w:val="Normal1"/>
+                <w:rFonts w:ascii="Aptos Display" w:hAnsi="Aptos Display"/>
+              </w:rPr>
+              <w:t>equipos}{</w:t>
+            </w:r>
+            <w:proofErr w:type="gramEnd"/>
+            <w:r>
+              <w:rPr>
+                <w:rStyle w:val="Normal1"/>
+                <w:rFonts w:ascii="Aptos Display" w:hAnsi="Aptos Display"/>
+              </w:rPr>
+              <w:t>tipo}</w:t>
             </w:r>
           </w:p>
         </w:tc>
@@ -586,7 +693,23 @@
                 <w:rStyle w:val="Normal1"/>
                 <w:rFonts w:ascii="Aptos Display" w:hAnsi="Aptos Display"/>
               </w:rPr>
-              <w:t>{marca_modelo}</w:t>
+              <w:t>{</w:t>
+            </w:r>
+            <w:proofErr w:type="spellStart"/>
+            <w:r>
+              <w:rPr>
+                <w:rStyle w:val="Normal1"/>
+                <w:rFonts w:ascii="Aptos Display" w:hAnsi="Aptos Display"/>
+              </w:rPr>
+              <w:t>marca_modelo</w:t>
+            </w:r>
+            <w:proofErr w:type="spellEnd"/>
+            <w:r>
+              <w:rPr>
+                <w:rStyle w:val="Normal1"/>
+                <w:rFonts w:ascii="Aptos Display" w:hAnsi="Aptos Display"/>
+              </w:rPr>
+              <w:t>}</w:t>
             </w:r>
           </w:p>
         </w:tc>
@@ -703,7 +826,23 @@
                 <w:rStyle w:val="Normal1"/>
                 <w:rFonts w:ascii="Aptos Display" w:hAnsi="Aptos Display"/>
               </w:rPr>
-              <w:t>{fecha_entrega}</w:t>
+              <w:t>{</w:t>
+            </w:r>
+            <w:proofErr w:type="spellStart"/>
+            <w:r>
+              <w:rPr>
+                <w:rStyle w:val="Normal1"/>
+                <w:rFonts w:ascii="Aptos Display" w:hAnsi="Aptos Display"/>
+              </w:rPr>
+              <w:t>fecha_entrega</w:t>
+            </w:r>
+            <w:proofErr w:type="spellEnd"/>
+            <w:r>
+              <w:rPr>
+                <w:rStyle w:val="Normal1"/>
+                <w:rFonts w:ascii="Aptos Display" w:hAnsi="Aptos Display"/>
+              </w:rPr>
+              <w:t>}</w:t>
             </w:r>
           </w:p>
         </w:tc>
@@ -725,7 +864,23 @@
                 <w:rStyle w:val="Normal1"/>
                 <w:rFonts w:ascii="Aptos Display" w:hAnsi="Aptos Display"/>
               </w:rPr>
-              <w:t>{hora_entrega}</w:t>
+              <w:t>{</w:t>
+            </w:r>
+            <w:proofErr w:type="spellStart"/>
+            <w:r>
+              <w:rPr>
+                <w:rStyle w:val="Normal1"/>
+                <w:rFonts w:ascii="Aptos Display" w:hAnsi="Aptos Display"/>
+              </w:rPr>
+              <w:t>hora_entrega</w:t>
+            </w:r>
+            <w:proofErr w:type="spellEnd"/>
+            <w:r>
+              <w:rPr>
+                <w:rStyle w:val="Normal1"/>
+                <w:rFonts w:ascii="Aptos Display" w:hAnsi="Aptos Display"/>
+              </w:rPr>
+              <w:t>}</w:t>
             </w:r>
           </w:p>
         </w:tc>
@@ -747,7 +902,23 @@
                 <w:rStyle w:val="Normal1"/>
                 <w:rFonts w:ascii="Aptos Display" w:hAnsi="Aptos Display"/>
               </w:rPr>
-              <w:t>{fecha_devolucion}</w:t>
+              <w:t>{</w:t>
+            </w:r>
+            <w:proofErr w:type="spellStart"/>
+            <w:r>
+              <w:rPr>
+                <w:rStyle w:val="Normal1"/>
+                <w:rFonts w:ascii="Aptos Display" w:hAnsi="Aptos Display"/>
+              </w:rPr>
+              <w:t>fecha_devolucion</w:t>
+            </w:r>
+            <w:proofErr w:type="spellEnd"/>
+            <w:r>
+              <w:rPr>
+                <w:rStyle w:val="Normal1"/>
+                <w:rFonts w:ascii="Aptos Display" w:hAnsi="Aptos Display"/>
+              </w:rPr>
+              <w:t>}</w:t>
             </w:r>
           </w:p>
         </w:tc>
@@ -768,7 +939,23 @@
                 <w:rStyle w:val="Normal1"/>
                 <w:rFonts w:ascii="Aptos Display" w:hAnsi="Aptos Display"/>
               </w:rPr>
-              <w:t>{hora_devolucion}</w:t>
+              <w:t>{</w:t>
+            </w:r>
+            <w:proofErr w:type="spellStart"/>
+            <w:r>
+              <w:rPr>
+                <w:rStyle w:val="Normal1"/>
+                <w:rFonts w:ascii="Aptos Display" w:hAnsi="Aptos Display"/>
+              </w:rPr>
+              <w:t>hora_devolucion</w:t>
+            </w:r>
+            <w:proofErr w:type="spellEnd"/>
+            <w:r>
+              <w:rPr>
+                <w:rStyle w:val="Normal1"/>
+                <w:rFonts w:ascii="Aptos Display" w:hAnsi="Aptos Display"/>
+              </w:rPr>
+              <w:t>}</w:t>
             </w:r>
           </w:p>
         </w:tc>
@@ -803,6 +990,7 @@
           </w:tcPr>
           <w:p>
             <w:pPr>
+              <w:jc w:val="center"/>
               <w:rPr>
                 <w:rStyle w:val="Normal1"/>
                 <w:rFonts w:ascii="Aptos Display" w:hAnsi="Aptos Display"/>
@@ -6458,6 +6646,27 @@
 </file>
 
 <file path=customXml/item1.xml><?xml version="1.0" encoding="utf-8"?>
+<p:properties xmlns:p="http://schemas.microsoft.com/office/2006/metadata/properties" xmlns:xsi="http://www.w3.org/2001/XMLSchema-instance" xmlns:pc="http://schemas.microsoft.com/office/infopath/2007/PartnerControls">
+  <documentManagement>
+    <_activity xmlns="bcce9e69-2193-489b-8979-bcf4d9513be1" xsi:nil="true"/>
+  </documentManagement>
+</p:properties>
+</file>
+
+<file path=customXml/item2.xml><?xml version="1.0" encoding="utf-8"?>
+<?mso-contentType ?>
+<FormTemplates xmlns="http://schemas.microsoft.com/sharepoint/v3/contenttype/forms">
+  <Display>DocumentLibraryForm</Display>
+  <Edit>DocumentLibraryForm</Edit>
+  <New>DocumentLibraryForm</New>
+</FormTemplates>
+</file>
+
+<file path=customXml/item3.xml><?xml version="1.0" encoding="utf-8"?>
+<b:Sources xmlns:b="http://schemas.openxmlformats.org/officeDocument/2006/bibliography" xmlns="http://schemas.openxmlformats.org/officeDocument/2006/bibliography" SelectedStyle="\APA.XSL" StyleName="APA"/>
+</file>
+
+<file path=customXml/item4.xml><?xml version="1.0" encoding="utf-8"?>
 <ct:contentTypeSchema xmlns:ct="http://schemas.microsoft.com/office/2006/metadata/contentType" xmlns:ma="http://schemas.microsoft.com/office/2006/metadata/properties/metaAttributes" ct:_="" ma:_="" ma:contentTypeName="Document" ma:contentTypeID="0x010100D2977320FF50BE48B7E8EE87EBCF0601" ma:contentTypeVersion="11" ma:contentTypeDescription="Create a new document." ma:contentTypeScope="" ma:versionID="d3e0c027367d740cbf39034df56ffe22">
   <xsd:schema xmlns:xsd="http://www.w3.org/2001/XMLSchema" xmlns:xs="http://www.w3.org/2001/XMLSchema" xmlns:p="http://schemas.microsoft.com/office/2006/metadata/properties" xmlns:ns3="bcce9e69-2193-489b-8979-bcf4d9513be1" targetNamespace="http://schemas.microsoft.com/office/2006/metadata/properties" ma:root="true" ma:fieldsID="28b1c348ba72a3784f3915424c61e130" ns3:_="">
     <xsd:import namespace="bcce9e69-2193-489b-8979-bcf4d9513be1"/>
@@ -6645,28 +6854,33 @@
 </ct:contentTypeSchema>
 </file>
 
-<file path=customXml/item2.xml><?xml version="1.0" encoding="utf-8"?>
-<b:Sources xmlns:b="http://schemas.openxmlformats.org/officeDocument/2006/bibliography" xmlns="http://schemas.openxmlformats.org/officeDocument/2006/bibliography" SelectedStyle="\APA.XSL" StyleName="APA"/>
+<file path=customXml/itemProps1.xml><?xml version="1.0" encoding="utf-8"?>
+<ds:datastoreItem xmlns:ds="http://schemas.openxmlformats.org/officeDocument/2006/customXml" ds:itemID="{B8E5FF8D-93DF-42F5-8D0C-D6D6D31AB061}">
+  <ds:schemaRefs>
+    <ds:schemaRef ds:uri="http://schemas.microsoft.com/office/2006/metadata/properties"/>
+    <ds:schemaRef ds:uri="http://schemas.microsoft.com/office/infopath/2007/PartnerControls"/>
+    <ds:schemaRef ds:uri="bcce9e69-2193-489b-8979-bcf4d9513be1"/>
+  </ds:schemaRefs>
+</ds:datastoreItem>
 </file>
 
-<file path=customXml/item3.xml><?xml version="1.0" encoding="utf-8"?>
-<?mso-contentType ?>
-<FormTemplates xmlns="http://schemas.microsoft.com/sharepoint/v3/contenttype/forms">
-  <Display>DocumentLibraryForm</Display>
-  <Edit>DocumentLibraryForm</Edit>
-  <New>DocumentLibraryForm</New>
-</FormTemplates>
+<file path=customXml/itemProps2.xml><?xml version="1.0" encoding="utf-8"?>
+<ds:datastoreItem xmlns:ds="http://schemas.openxmlformats.org/officeDocument/2006/customXml" ds:itemID="{4FB0072D-4D86-4287-A28D-140B2D94D6E6}">
+  <ds:schemaRefs>
+    <ds:schemaRef ds:uri="http://schemas.microsoft.com/sharepoint/v3/contenttype/forms"/>
+  </ds:schemaRefs>
+</ds:datastoreItem>
 </file>
 
-<file path=customXml/item4.xml><?xml version="1.0" encoding="utf-8"?>
-<p:properties xmlns:p="http://schemas.microsoft.com/office/2006/metadata/properties" xmlns:xsi="http://www.w3.org/2001/XMLSchema-instance" xmlns:pc="http://schemas.microsoft.com/office/infopath/2007/PartnerControls">
-  <documentManagement>
-    <_activity xmlns="bcce9e69-2193-489b-8979-bcf4d9513be1" xsi:nil="true"/>
-  </documentManagement>
-</p:properties>
+<file path=customXml/itemProps3.xml><?xml version="1.0" encoding="utf-8"?>
+<ds:datastoreItem xmlns:ds="http://schemas.openxmlformats.org/officeDocument/2006/customXml" ds:itemID="{5AF88806-9421-4965-9206-D524E6254C01}">
+  <ds:schemaRefs>
+    <ds:schemaRef ds:uri="http://schemas.openxmlformats.org/officeDocument/2006/bibliography"/>
+  </ds:schemaRefs>
+</ds:datastoreItem>
 </file>
 
-<file path=customXml/itemProps1.xml><?xml version="1.0" encoding="utf-8"?>
+<file path=customXml/itemProps4.xml><?xml version="1.0" encoding="utf-8"?>
 <ds:datastoreItem xmlns:ds="http://schemas.openxmlformats.org/officeDocument/2006/customXml" ds:itemID="{48A79393-5999-4CA9-8AB6-5E47C855988B}">
   <ds:schemaRefs>
     <ds:schemaRef ds:uri="http://schemas.microsoft.com/office/2006/metadata/contentType"/>
@@ -6684,32 +6898,6 @@
 </ds:datastoreItem>
 </file>
 
-<file path=customXml/itemProps2.xml><?xml version="1.0" encoding="utf-8"?>
-<ds:datastoreItem xmlns:ds="http://schemas.openxmlformats.org/officeDocument/2006/customXml" ds:itemID="{5AF88806-9421-4965-9206-D524E6254C01}">
-  <ds:schemaRefs>
-    <ds:schemaRef ds:uri="http://schemas.openxmlformats.org/officeDocument/2006/bibliography"/>
-  </ds:schemaRefs>
-</ds:datastoreItem>
-</file>
-
-<file path=customXml/itemProps3.xml><?xml version="1.0" encoding="utf-8"?>
-<ds:datastoreItem xmlns:ds="http://schemas.openxmlformats.org/officeDocument/2006/customXml" ds:itemID="{4FB0072D-4D86-4287-A28D-140B2D94D6E6}">
-  <ds:schemaRefs>
-    <ds:schemaRef ds:uri="http://schemas.microsoft.com/sharepoint/v3/contenttype/forms"/>
-  </ds:schemaRefs>
-</ds:datastoreItem>
-</file>
-
-<file path=customXml/itemProps4.xml><?xml version="1.0" encoding="utf-8"?>
-<ds:datastoreItem xmlns:ds="http://schemas.openxmlformats.org/officeDocument/2006/customXml" ds:itemID="{B8E5FF8D-93DF-42F5-8D0C-D6D6D31AB061}">
-  <ds:schemaRefs>
-    <ds:schemaRef ds:uri="http://schemas.microsoft.com/office/2006/metadata/properties"/>
-    <ds:schemaRef ds:uri="http://schemas.microsoft.com/office/infopath/2007/PartnerControls"/>
-    <ds:schemaRef ds:uri="bcce9e69-2193-489b-8979-bcf4d9513be1"/>
-  </ds:schemaRefs>
-</ds:datastoreItem>
-</file>
-
 <file path=docMetadata/LabelInfo.xml><?xml version="1.0" encoding="utf-8"?>
 <clbl:labelList xmlns:clbl="http://schemas.microsoft.com/office/2020/mipLabelMetadata">
   <clbl:label id="{98533b19-5b8e-4b87-8bd4-14d058a7d451}" enabled="0" method="" siteId="{98533b19-5b8e-4b87-8bd4-14d058a7d451}" removed="1"/>

</xml_diff>

<commit_message>
Fix Admin RUT in Dashboard and add Assignment Acta to Mis Equipos
</commit_message>
<xml_diff>
--- a/public/acta_prestamo.docx
+++ b/public/acta_prestamo.docx
@@ -656,23 +656,7 @@
                 <w:rStyle w:val="Normal1"/>
                 <w:rFonts w:ascii="Aptos Display" w:hAnsi="Aptos Display"/>
               </w:rPr>
-              <w:t>{#</w:t>
-            </w:r>
-            <w:proofErr w:type="gramStart"/>
-            <w:r>
-              <w:rPr>
-                <w:rStyle w:val="Normal1"/>
-                <w:rFonts w:ascii="Aptos Display" w:hAnsi="Aptos Display"/>
-              </w:rPr>
-              <w:t>equipos}{</w:t>
-            </w:r>
-            <w:proofErr w:type="gramEnd"/>
-            <w:r>
-              <w:rPr>
-                <w:rStyle w:val="Normal1"/>
-                <w:rFonts w:ascii="Aptos Display" w:hAnsi="Aptos Display"/>
-              </w:rPr>
-              <w:t>tipo}</w:t>
+              <w:t>{#equipos}{tipo}</w:t>
             </w:r>
           </w:p>
         </w:tc>
@@ -834,7 +818,14 @@
                 <w:rStyle w:val="Normal1"/>
                 <w:rFonts w:ascii="Aptos Display" w:hAnsi="Aptos Display"/>
               </w:rPr>
-              <w:t>fecha_entrega</w:t>
+              <w:t>fecha_</w:t>
+            </w:r>
+            <w:r>
+              <w:rPr>
+                <w:rStyle w:val="Normal1"/>
+                <w:rFonts w:ascii="Aptos Display" w:hAnsi="Aptos Display"/>
+              </w:rPr>
+              <w:t>inicio</w:t>
             </w:r>
             <w:proofErr w:type="spellEnd"/>
             <w:r>
@@ -872,7 +863,14 @@
                 <w:rStyle w:val="Normal1"/>
                 <w:rFonts w:ascii="Aptos Display" w:hAnsi="Aptos Display"/>
               </w:rPr>
-              <w:t>hora_entrega</w:t>
+              <w:t>hora_</w:t>
+            </w:r>
+            <w:r>
+              <w:rPr>
+                <w:rStyle w:val="Normal1"/>
+                <w:rFonts w:ascii="Aptos Display" w:hAnsi="Aptos Display"/>
+              </w:rPr>
+              <w:t>inicio</w:t>
             </w:r>
             <w:proofErr w:type="spellEnd"/>
             <w:r>
@@ -910,7 +908,14 @@
                 <w:rStyle w:val="Normal1"/>
                 <w:rFonts w:ascii="Aptos Display" w:hAnsi="Aptos Display"/>
               </w:rPr>
-              <w:t>fecha_devolucion</w:t>
+              <w:t>fecha_</w:t>
+            </w:r>
+            <w:r>
+              <w:rPr>
+                <w:rStyle w:val="Normal1"/>
+                <w:rFonts w:ascii="Aptos Display" w:hAnsi="Aptos Display"/>
+              </w:rPr>
+              <w:t>fin</w:t>
             </w:r>
             <w:proofErr w:type="spellEnd"/>
             <w:r>
@@ -947,7 +952,14 @@
                 <w:rStyle w:val="Normal1"/>
                 <w:rFonts w:ascii="Aptos Display" w:hAnsi="Aptos Display"/>
               </w:rPr>
-              <w:t>hora_devolucion</w:t>
+              <w:t>hora_</w:t>
+            </w:r>
+            <w:r>
+              <w:rPr>
+                <w:rStyle w:val="Normal1"/>
+                <w:rFonts w:ascii="Aptos Display" w:hAnsi="Aptos Display"/>
+              </w:rPr>
+              <w:t>fin</w:t>
             </w:r>
             <w:proofErr w:type="spellEnd"/>
             <w:r>
@@ -6646,27 +6658,6 @@
 </file>
 
 <file path=customXml/item1.xml><?xml version="1.0" encoding="utf-8"?>
-<p:properties xmlns:p="http://schemas.microsoft.com/office/2006/metadata/properties" xmlns:xsi="http://www.w3.org/2001/XMLSchema-instance" xmlns:pc="http://schemas.microsoft.com/office/infopath/2007/PartnerControls">
-  <documentManagement>
-    <_activity xmlns="bcce9e69-2193-489b-8979-bcf4d9513be1" xsi:nil="true"/>
-  </documentManagement>
-</p:properties>
-</file>
-
-<file path=customXml/item2.xml><?xml version="1.0" encoding="utf-8"?>
-<?mso-contentType ?>
-<FormTemplates xmlns="http://schemas.microsoft.com/sharepoint/v3/contenttype/forms">
-  <Display>DocumentLibraryForm</Display>
-  <Edit>DocumentLibraryForm</Edit>
-  <New>DocumentLibraryForm</New>
-</FormTemplates>
-</file>
-
-<file path=customXml/item3.xml><?xml version="1.0" encoding="utf-8"?>
-<b:Sources xmlns:b="http://schemas.openxmlformats.org/officeDocument/2006/bibliography" xmlns="http://schemas.openxmlformats.org/officeDocument/2006/bibliography" SelectedStyle="\APA.XSL" StyleName="APA"/>
-</file>
-
-<file path=customXml/item4.xml><?xml version="1.0" encoding="utf-8"?>
 <ct:contentTypeSchema xmlns:ct="http://schemas.microsoft.com/office/2006/metadata/contentType" xmlns:ma="http://schemas.microsoft.com/office/2006/metadata/properties/metaAttributes" ct:_="" ma:_="" ma:contentTypeName="Document" ma:contentTypeID="0x010100D2977320FF50BE48B7E8EE87EBCF0601" ma:contentTypeVersion="11" ma:contentTypeDescription="Create a new document." ma:contentTypeScope="" ma:versionID="d3e0c027367d740cbf39034df56ffe22">
   <xsd:schema xmlns:xsd="http://www.w3.org/2001/XMLSchema" xmlns:xs="http://www.w3.org/2001/XMLSchema" xmlns:p="http://schemas.microsoft.com/office/2006/metadata/properties" xmlns:ns3="bcce9e69-2193-489b-8979-bcf4d9513be1" targetNamespace="http://schemas.microsoft.com/office/2006/metadata/properties" ma:root="true" ma:fieldsID="28b1c348ba72a3784f3915424c61e130" ns3:_="">
     <xsd:import namespace="bcce9e69-2193-489b-8979-bcf4d9513be1"/>
@@ -6854,33 +6845,28 @@
 </ct:contentTypeSchema>
 </file>
 
-<file path=customXml/itemProps1.xml><?xml version="1.0" encoding="utf-8"?>
-<ds:datastoreItem xmlns:ds="http://schemas.openxmlformats.org/officeDocument/2006/customXml" ds:itemID="{B8E5FF8D-93DF-42F5-8D0C-D6D6D31AB061}">
-  <ds:schemaRefs>
-    <ds:schemaRef ds:uri="http://schemas.microsoft.com/office/2006/metadata/properties"/>
-    <ds:schemaRef ds:uri="http://schemas.microsoft.com/office/infopath/2007/PartnerControls"/>
-    <ds:schemaRef ds:uri="bcce9e69-2193-489b-8979-bcf4d9513be1"/>
-  </ds:schemaRefs>
-</ds:datastoreItem>
+<file path=customXml/item2.xml><?xml version="1.0" encoding="utf-8"?>
+<b:Sources xmlns:b="http://schemas.openxmlformats.org/officeDocument/2006/bibliography" xmlns="http://schemas.openxmlformats.org/officeDocument/2006/bibliography" SelectedStyle="\APA.XSL" StyleName="APA"/>
 </file>
 
-<file path=customXml/itemProps2.xml><?xml version="1.0" encoding="utf-8"?>
-<ds:datastoreItem xmlns:ds="http://schemas.openxmlformats.org/officeDocument/2006/customXml" ds:itemID="{4FB0072D-4D86-4287-A28D-140B2D94D6E6}">
-  <ds:schemaRefs>
-    <ds:schemaRef ds:uri="http://schemas.microsoft.com/sharepoint/v3/contenttype/forms"/>
-  </ds:schemaRefs>
-</ds:datastoreItem>
+<file path=customXml/item3.xml><?xml version="1.0" encoding="utf-8"?>
+<?mso-contentType ?>
+<FormTemplates xmlns="http://schemas.microsoft.com/sharepoint/v3/contenttype/forms">
+  <Display>DocumentLibraryForm</Display>
+  <Edit>DocumentLibraryForm</Edit>
+  <New>DocumentLibraryForm</New>
+</FormTemplates>
 </file>
 
-<file path=customXml/itemProps3.xml><?xml version="1.0" encoding="utf-8"?>
-<ds:datastoreItem xmlns:ds="http://schemas.openxmlformats.org/officeDocument/2006/customXml" ds:itemID="{5AF88806-9421-4965-9206-D524E6254C01}">
-  <ds:schemaRefs>
-    <ds:schemaRef ds:uri="http://schemas.openxmlformats.org/officeDocument/2006/bibliography"/>
-  </ds:schemaRefs>
-</ds:datastoreItem>
+<file path=customXml/item4.xml><?xml version="1.0" encoding="utf-8"?>
+<p:properties xmlns:p="http://schemas.microsoft.com/office/2006/metadata/properties" xmlns:xsi="http://www.w3.org/2001/XMLSchema-instance" xmlns:pc="http://schemas.microsoft.com/office/infopath/2007/PartnerControls">
+  <documentManagement>
+    <_activity xmlns="bcce9e69-2193-489b-8979-bcf4d9513be1" xsi:nil="true"/>
+  </documentManagement>
+</p:properties>
 </file>
 
-<file path=customXml/itemProps4.xml><?xml version="1.0" encoding="utf-8"?>
+<file path=customXml/itemProps1.xml><?xml version="1.0" encoding="utf-8"?>
 <ds:datastoreItem xmlns:ds="http://schemas.openxmlformats.org/officeDocument/2006/customXml" ds:itemID="{48A79393-5999-4CA9-8AB6-5E47C855988B}">
   <ds:schemaRefs>
     <ds:schemaRef ds:uri="http://schemas.microsoft.com/office/2006/metadata/contentType"/>
@@ -6898,6 +6884,32 @@
 </ds:datastoreItem>
 </file>
 
+<file path=customXml/itemProps2.xml><?xml version="1.0" encoding="utf-8"?>
+<ds:datastoreItem xmlns:ds="http://schemas.openxmlformats.org/officeDocument/2006/customXml" ds:itemID="{5AF88806-9421-4965-9206-D524E6254C01}">
+  <ds:schemaRefs>
+    <ds:schemaRef ds:uri="http://schemas.openxmlformats.org/officeDocument/2006/bibliography"/>
+  </ds:schemaRefs>
+</ds:datastoreItem>
+</file>
+
+<file path=customXml/itemProps3.xml><?xml version="1.0" encoding="utf-8"?>
+<ds:datastoreItem xmlns:ds="http://schemas.openxmlformats.org/officeDocument/2006/customXml" ds:itemID="{4FB0072D-4D86-4287-A28D-140B2D94D6E6}">
+  <ds:schemaRefs>
+    <ds:schemaRef ds:uri="http://schemas.microsoft.com/sharepoint/v3/contenttype/forms"/>
+  </ds:schemaRefs>
+</ds:datastoreItem>
+</file>
+
+<file path=customXml/itemProps4.xml><?xml version="1.0" encoding="utf-8"?>
+<ds:datastoreItem xmlns:ds="http://schemas.openxmlformats.org/officeDocument/2006/customXml" ds:itemID="{B8E5FF8D-93DF-42F5-8D0C-D6D6D31AB061}">
+  <ds:schemaRefs>
+    <ds:schemaRef ds:uri="http://schemas.microsoft.com/office/2006/metadata/properties"/>
+    <ds:schemaRef ds:uri="http://schemas.microsoft.com/office/infopath/2007/PartnerControls"/>
+    <ds:schemaRef ds:uri="bcce9e69-2193-489b-8979-bcf4d9513be1"/>
+  </ds:schemaRefs>
+</ds:datastoreItem>
+</file>
+
 <file path=docMetadata/LabelInfo.xml><?xml version="1.0" encoding="utf-8"?>
 <clbl:labelList xmlns:clbl="http://schemas.microsoft.com/office/2020/mipLabelMetadata">
   <clbl:label id="{98533b19-5b8e-4b87-8bd4-14d058a7d451}" enabled="0" method="" siteId="{98533b19-5b8e-4b87-8bd4-14d058a7d451}" removed="1"/>

</xml_diff>